<commit_message>
Align docs, paper, and collateral with current codebase
</commit_message>
<xml_diff>
--- a/linkedin_caliber/LinkedIn_Article_CALIBER.docx
+++ b/linkedin_caliber/LinkedIn_Article_CALIBER.docx
@@ -91,7 +91,7 @@
           <w:i/>
           <w:iCs/>
         </w:rPr>
-        <w:t xml:space="preserve">CALIBER: A Layered Control Plane for Per-Family Governance of AI-Agent Resources</w:t>
+        <w:t xml:space="preserve">CALIBER: A Layered Control Plane for AI Agent Governance, Workflow Orchestration, and Progressive Autonomy</w:t>
       </w:r>
       <w:r>
         <w:t xml:space="preserve">, we close it across nine resource families at once, around a single abstraction called the</w:t>
@@ -1420,7 +1420,7 @@
           <w:i/>
           <w:iCs/>
         </w:rPr>
-        <w:t xml:space="preserve">CALIBER: A Layered Control Plane for Per-Family Governance of AI-Agent Resources</w:t>
+        <w:t xml:space="preserve">CALIBER: A Layered Control Plane for AI Agent Governance, Workflow Orchestration, and Progressive Autonomy</w:t>
       </w:r>
       <w:r>
         <w:t xml:space="preserve"> </w:t>

</xml_diff>